<commit_message>
Final copy pass on assessment split: new Path A headline, cleaned commas/fragments, fixed negation-cadence violation in Path B body
Co-Authored-By: Claude Sonnet 5 <noreply@anthropic.com>
Claude-Session: https://claude.ai/code/session_01N8pyC7kzrM7G1tXtxT56eA
</commit_message>
<xml_diff>
--- a/outputs/website-redesign/2026-10-09-core-business-assessment-split-copy.docx
+++ b/outputs/website-redesign/2026-10-09-core-business-assessment-split-copy.docx
@@ -203,7 +203,7 @@
           <w:sz w:val="22"/>
           <w:szCs w:val="22"/>
         </w:rPr>
-        <w:t xml:space="preserve">“Things feel inconsistent. Growth has stalled, and honestly, I can't figure out the fix.”</w:t>
+        <w:t xml:space="preserve">“Things feel inconsistent. Growth has stalled. Honestly, I can't figure out the fix.”</w:t>
       </w:r>
     </w:p>
     <w:p>
@@ -223,7 +223,7 @@
           <w:sz w:val="22"/>
           <w:szCs w:val="22"/>
         </w:rPr>
-        <w:t xml:space="preserve">“I'm buried. Everything runs through me, and there's no room to breathe.”</w:t>
+        <w:t xml:space="preserve">“I'm buried. Everything runs through me. There's no room to breathe.”</w:t>
       </w:r>
     </w:p>
     <w:p>
@@ -271,7 +271,7 @@
           <w:sz w:val="22"/>
           <w:szCs w:val="22"/>
         </w:rPr>
-        <w:t xml:space="preserve">You're up and running. It's time to check its strength.</w:t>
+        <w:t xml:space="preserve">Your business is up and running. Make sure it's built for growth.</w:t>
       </w:r>
     </w:p>
     <w:p>
@@ -300,7 +300,7 @@
           <w:sz w:val="22"/>
           <w:szCs w:val="22"/>
         </w:rPr>
-        <w:t xml:space="preserve">Sixty-five questions across ten areas, about twenty minutes total. At the end you'll know which part of the business needs attention first, and which parts are fine to leave alone for now.</w:t>
+        <w:t xml:space="preserve">It's sixty-five questions across ten areas, about twenty minutes total. At the end you'll know which part of the business needs attention first and which parts are fine to leave alone for now.</w:t>
       </w:r>
     </w:p>
     <w:p>
@@ -329,7 +329,7 @@
           <w:sz w:val="22"/>
           <w:szCs w:val="22"/>
         </w:rPr>
-        <w:t xml:space="preserve">Most owners at this stage are underpricing without realizing it, and running cash flow more on instinct than on any real plan. Days get eaten by whatever's loudest instead of what actually moves things forward. That's normal here. It's also the kind of thing that's easy to fix once you can see it clearly.</w:t>
+        <w:t xml:space="preserve">Most owners at this stage are underpricing without realizing it. They're running cash flow more on instinct than on any real plan. Days get eaten by whatever's loudest instead of what actually moves things forward. That's normal here. It's also the kind of thing that's easy to fix once you can see it clearly.</w:t>
       </w:r>
     </w:p>
     <w:p>
@@ -435,7 +435,7 @@
           <w:sz w:val="22"/>
           <w:szCs w:val="22"/>
         </w:rPr>
-        <w:t xml:space="preserve">Thirty-five questions across ten areas, about twenty minutes total. This covers everyone from the first real growing pains past $500K through the complexity wall that tends to hit again around $3 to $4 million. Whichever mile marker you're at, the business moved faster than the systems running it.</w:t>
+        <w:t xml:space="preserve">It's thirty-five questions across ten areas, about twenty minutes total. This covers everyone from the first real growing pains past $500K through the complexity wall that tends to hit again around $3 to $4 million. Whichever mile marker you're at, the business moved faster than the systems running it.</w:t>
       </w:r>
     </w:p>
     <w:p>
@@ -464,7 +464,7 @@
           <w:sz w:val="22"/>
           <w:szCs w:val="22"/>
         </w:rPr>
-        <w:t xml:space="preserve">Most owners in this range are stretched thinner than they'd admit. They're still in the middle of every decision, and good people keep walking out the door. Service slips the moment volume climbs. None of that means something went wrong. It means growth keeps asking for a new version of the business, and the systems haven't caught up to this one yet.</w:t>
+        <w:t xml:space="preserve">Most owners in this range are stretched thinner than they'd admit. They're still in the middle of every decision, and good people keep walking out the door. Service slips the moment volume climbs. Growth does that. It keeps asking for a new version of the business, and the systems haven't caught up to this one yet.</w:t>
       </w:r>
     </w:p>
     <w:p>

</xml_diff>

<commit_message>
Line-level copy edits across both paths; add optional "How did you hear about us?" field to both forms
Co-Authored-By: Claude Sonnet 5 <noreply@anthropic.com>
Claude-Session: https://claude.ai/code/session_01N8pyC7kzrM7G1tXtxT56eA
</commit_message>
<xml_diff>
--- a/outputs/website-redesign/2026-10-09-core-business-assessment-split-copy.docx
+++ b/outputs/website-redesign/2026-10-09-core-business-assessment-split-copy.docx
@@ -300,7 +300,7 @@
           <w:sz w:val="22"/>
           <w:szCs w:val="22"/>
         </w:rPr>
-        <w:t xml:space="preserve">It's sixty-five questions across ten areas, about twenty minutes total. At the end you'll know which part of the business needs attention first and which parts are fine to leave alone for now.</w:t>
+        <w:t xml:space="preserve">Answer sixty-five questions across ten areas in about twenty minutes. At the end you'll know which part of the business needs attention first and which parts are fine to leave alone for now.</w:t>
       </w:r>
     </w:p>
     <w:p>
@@ -329,7 +329,7 @@
           <w:sz w:val="22"/>
           <w:szCs w:val="22"/>
         </w:rPr>
-        <w:t xml:space="preserve">Most owners at this stage are underpricing without realizing it. They're running cash flow more on instinct than on any real plan. Days get eaten by whatever's loudest instead of what actually moves things forward. That's normal here. It's also the kind of thing that's easy to fix once you can see it clearly.</w:t>
+        <w:t xml:space="preserve">Most owners at this stage are underpricing without realizing it. They're running cash flow more on instinct than on a plan. Days get eaten by whatever's loudest instead of what actually moves things forward. That's normal in this stage. It's also the kind of thing that's easy to fix once you see it clearly.</w:t>
       </w:r>
     </w:p>
     <w:p>
@@ -435,7 +435,7 @@
           <w:sz w:val="22"/>
           <w:szCs w:val="22"/>
         </w:rPr>
-        <w:t xml:space="preserve">It's thirty-five questions across ten areas, about twenty minutes total. This covers everyone from the first real growing pains past $500K through the walls that tend to hit again around $1 million and again around $3 to $4 million. Whichever mile marker you're at, the business moved faster than the systems running it.</w:t>
+        <w:t xml:space="preserve">Answer thirty-five questions across ten areas in about twenty minutes. This covers everyone from the first real growing pains past $500K through the walls that tend to hit again around $1 million and again around $3 to $4 million. Whichever mile marker you're at, the business moved faster than the systems running it.</w:t>
       </w:r>
     </w:p>
     <w:p>
@@ -464,7 +464,7 @@
           <w:sz w:val="22"/>
           <w:szCs w:val="22"/>
         </w:rPr>
-        <w:t xml:space="preserve">Most owners in this range are stretched thinner than they'd admit. They're still in the middle of every decision, and good people keep walking out the door. Service slips the moment volume climbs. Growth does that. It keeps asking for a new version of the business, and the systems haven't caught up to this one yet.</w:t>
+        <w:t xml:space="preserve">Most owners in this range are stretched thinner than they'd admit. They're still in the middle of every decision, and good people are walking out the door. As volume climbs, service begins to slip. Growth does that. It keeps asking for a new version of the business, and the systems haven't caught up to this one yet.</w:t>
       </w:r>
     </w:p>
     <w:p>
@@ -526,7 +526,21 @@
           <w:sz w:val="22"/>
           <w:szCs w:val="22"/>
         </w:rPr>
-        <w:t xml:space="preserve">Same pattern as the live Free Business Assessment page (HubSpot portal 110120, direct-download, no email): Name, Email, Company (optional), then the routing answer as a field. One form, one handler, conditional logic sends the matching PDF — the Stage 1/Stage 2 split docs already built (2026-10-08-core-business-assessment-stage1-core.docx and -stage2-expansion.docx).</w:t>
+        <w:t xml:space="preserve">Same pattern as the live Free Business Assessment page (HubSpot portal 110120, direct-download, no email): Name, Email, Company (optional), How did you hear about us? (optional), then the routing answer as a field. One form, one handler, conditional logic sends the matching PDF — the Stage 1/Stage 2 split docs already built (2026-10-08-core-business-assessment-stage1-core.docx and -stage2-expansion.docx).</w:t>
+      </w:r>
+    </w:p>
+    <w:p>
+      <w:pPr>
+        <w:spacing w:after="100"/>
+      </w:pPr>
+      <w:r>
+        <w:rPr>
+          <w:b w:val="false"/>
+          <w:bCs w:val="false"/>
+          <w:sz w:val="22"/>
+          <w:szCs w:val="22"/>
+        </w:rPr>
+        <w:t xml:space="preserve">The “How did you hear about us?” field closes a real gap flagged in context/brand-positioning-metrics.md — no intake attribution exists anywhere in the business today, and this is a new form, so there's nothing to retrofit.</w:t>
       </w:r>
     </w:p>
     <w:sectPr>

</xml_diff>

<commit_message>
Pull the routing instruction out as a distinct gold-callout line, more visible than buried in the subhead
Co-Authored-By: Claude Sonnet 5 <noreply@anthropic.com>
Claude-Session: https://claude.ai/code/session_01N8pyC7kzrM7G1tXtxT56eA
</commit_message>
<xml_diff>
--- a/outputs/website-redesign/2026-10-09-core-business-assessment-split-copy.docx
+++ b/outputs/website-redesign/2026-10-09-core-business-assessment-split-copy.docx
@@ -154,7 +154,36 @@
           <w:sz w:val="22"/>
           <w:szCs w:val="22"/>
         </w:rPr>
-        <w:t xml:space="preserve">Most owners hit two walls on their way to growing and scaling their business. The first one feels like you're still finding your footing. The second feels like the business is running you. Answer one question and we'll send the assessment built for where you actually are.</w:t>
+        <w:t xml:space="preserve">Most owners hit two walls on their way to growing and scaling their business. The first one feels like you're still finding your footing. The second feels like the business is running you.</w:t>
+      </w:r>
+    </w:p>
+    <w:p>
+      <w:pPr>
+        <w:spacing w:after="40" w:before="140"/>
+      </w:pPr>
+      <w:r>
+        <w:rPr>
+          <w:b/>
+          <w:bCs/>
+          <w:color w:val="0F6E56"/>
+          <w:sz w:val="20"/>
+          <w:szCs w:val="20"/>
+        </w:rPr>
+        <w:t xml:space="preserve">Lead-in (styled as a distinct callout, not part of the subhead paragraph — needs visual weight)</w:t>
+      </w:r>
+    </w:p>
+    <w:p>
+      <w:pPr>
+        <w:spacing w:after="100"/>
+      </w:pPr>
+      <w:r>
+        <w:rPr>
+          <w:b w:val="false"/>
+          <w:bCs w:val="false"/>
+          <w:sz w:val="22"/>
+          <w:szCs w:val="22"/>
+        </w:rPr>
+        <w:t xml:space="preserve">Answer one question and we'll send the assessment built for where you actually are.</w:t>
       </w:r>
     </w:p>
     <w:p>

</xml_diff>

<commit_message>
Update split routing-page mockup: question counts (65->70, 35->50), Stage II time estimate, and assessment names to match actual PDF titles
Co-Authored-By: Claude Sonnet 5 <noreply@anthropic.com>
Claude-Session: https://claude.ai/code/session_01N8pyC7kzrM7G1tXtxT56eA
</commit_message>
<xml_diff>
--- a/outputs/website-redesign/2026-10-09-core-business-assessment-split-copy.docx
+++ b/outputs/website-redesign/2026-10-09-core-business-assessment-split-copy.docx
@@ -329,7 +329,7 @@
           <w:sz w:val="22"/>
           <w:szCs w:val="22"/>
         </w:rPr>
-        <w:t xml:space="preserve">Answer sixty-five questions across ten areas in about twenty minutes. At the end you'll know which part of the business needs attention first and which parts are fine to leave alone for now.</w:t>
+        <w:t xml:space="preserve">Answer seventy questions across ten areas in about twenty minutes. At the end you'll know which part of the business needs attention first and which parts are fine to leave alone for now.</w:t>
       </w:r>
     </w:p>
     <w:p>
@@ -464,7 +464,7 @@
           <w:sz w:val="22"/>
           <w:szCs w:val="22"/>
         </w:rPr>
-        <w:t xml:space="preserve">Answer thirty-five questions across ten areas in about twenty minutes. At the end you'll know which systems need to catch up first and which ones are already strong enough to carry more weight.</w:t>
+        <w:t xml:space="preserve">Answer fifty questions across ten areas in about twenty-five minutes. At the end you'll know which systems need to catch up first and which ones are already strong enough to carry more weight.</w:t>
       </w:r>
     </w:p>
     <w:p>

</xml_diff>